<commit_message>
Update docs and add verification notes
Clean up project documentation and add verification/insights. README: remove references to non-existing build_notebook.py and relatorio.{html,pdf}. Notebook: remove placeholder "Integrantes" line, update kernelspec to "learning-env" and Python version to 3.13.5, and normalize widget numeric fields. Report (t2-LM.docx): update (binary) — bibliography/refs edited. Add verificacao_enunciado_e_insights.txt: detailed reproducibility checks, final metrics, qualitative analysis, technical decisions and pending items (e.g. fill member names and export PDF).
</commit_message>
<xml_diff>
--- a/t2-LM.docx
+++ b/t2-LM.docx
@@ -4830,6 +4830,120 @@
         </w:rPr>
         <w:lastRenderedPageBreak/>
         <w:t>6. Referências</w:t>
+      </w:r>
+    </w:p>
+    <w:p>
+      <w:pPr>
+        <w:spacing w:after="120" w:line="240" w:lineRule="auto"/>
+        <w:jc w:val="both"/>
+        <w:rPr>
+          <w:rFonts w:ascii="Calibri" w:hAnsi="Calibri" w:cs="Calibri"/>
+          <w:sz w:val="22"/>
+          <w:szCs w:val="22"/>
+        </w:rPr>
+      </w:pPr>
+      <w:r>
+        <w:rPr>
+          <w:rFonts w:ascii="Calibri" w:hAnsi="Calibri" w:cs="Calibri"/>
+          <w:sz w:val="22"/>
+          <w:szCs w:val="22"/>
+        </w:rPr>
+        <w:t xml:space="preserve">[1] MANNING, C. D.; RAGHAVAN, P.; SCHÜTZE, H. Introduction to Information Retrieval. Cambridge University Press, 2008.</w:t>
+      </w:r>
+    </w:p>
+    <w:p>
+      <w:pPr>
+        <w:spacing w:after="120" w:line="240" w:lineRule="auto"/>
+        <w:jc w:val="both"/>
+        <w:rPr>
+          <w:rFonts w:ascii="Calibri" w:hAnsi="Calibri" w:cs="Calibri"/>
+          <w:sz w:val="22"/>
+          <w:szCs w:val="22"/>
+        </w:rPr>
+      </w:pPr>
+      <w:r>
+        <w:rPr>
+          <w:rFonts w:ascii="Calibri" w:hAnsi="Calibri" w:cs="Calibri"/>
+          <w:sz w:val="22"/>
+          <w:szCs w:val="22"/>
+        </w:rPr>
+        <w:t xml:space="preserve">[2] SALTON, G.; BUCKLEY, C. Term-weighting approaches in automatic text retrieval. Information Processing &amp; Management, v. 24, n. 5, p. 513-523, 1988.</w:t>
+      </w:r>
+    </w:p>
+    <w:p>
+      <w:pPr>
+        <w:spacing w:after="120" w:line="240" w:lineRule="auto"/>
+        <w:jc w:val="both"/>
+        <w:rPr>
+          <w:rFonts w:ascii="Calibri" w:hAnsi="Calibri" w:cs="Calibri"/>
+          <w:sz w:val="22"/>
+          <w:szCs w:val="22"/>
+        </w:rPr>
+      </w:pPr>
+      <w:r>
+        <w:rPr>
+          <w:rFonts w:ascii="Calibri" w:hAnsi="Calibri" w:cs="Calibri"/>
+          <w:sz w:val="22"/>
+          <w:szCs w:val="22"/>
+        </w:rPr>
+        <w:t xml:space="preserve">[3] ROBERTSON, S.; ZARAGOZA, H. The Probabilistic Relevance Framework: BM25 and Beyond. Foundations and Trends in Information Retrieval, v. 3, n. 4, p. 333-389, 2009.</w:t>
+      </w:r>
+    </w:p>
+    <w:p>
+      <w:pPr>
+        <w:spacing w:after="120" w:line="240" w:lineRule="auto"/>
+        <w:jc w:val="both"/>
+        <w:rPr>
+          <w:rFonts w:ascii="Calibri" w:hAnsi="Calibri" w:cs="Calibri"/>
+          <w:sz w:val="22"/>
+          <w:szCs w:val="22"/>
+        </w:rPr>
+      </w:pPr>
+      <w:r>
+        <w:rPr>
+          <w:rFonts w:ascii="Calibri" w:hAnsi="Calibri" w:cs="Calibri"/>
+          <w:sz w:val="22"/>
+          <w:szCs w:val="22"/>
+        </w:rPr>
+        <w:t xml:space="preserve">[4] VASWANI, A. et al. Attention is all you need. In: Advances in Neural Information Processing Systems (NeurIPS), 2017.</w:t>
+      </w:r>
+    </w:p>
+    <w:p>
+      <w:pPr>
+        <w:spacing w:after="120" w:line="240" w:lineRule="auto"/>
+        <w:jc w:val="both"/>
+        <w:rPr>
+          <w:rFonts w:ascii="Calibri" w:hAnsi="Calibri" w:cs="Calibri"/>
+          <w:sz w:val="22"/>
+          <w:szCs w:val="22"/>
+        </w:rPr>
+      </w:pPr>
+      <w:r>
+        <w:rPr>
+          <w:rFonts w:ascii="Calibri" w:hAnsi="Calibri" w:cs="Calibri"/>
+          <w:sz w:val="22"/>
+          <w:szCs w:val="22"/>
+        </w:rPr>
+        <w:t xml:space="preserve">[5] DEVLIN, J.; CHANG, M.-W.; LEE, K.; TOUTANOVA, K. BERT: Pre-training of Deep Bidirectional Transformers for Language Understanding. In: Proceedings of NAACL-HLT, 2019.</w:t>
+      </w:r>
+    </w:p>
+    <w:p>
+      <w:pPr>
+        <w:spacing w:after="120" w:line="240" w:lineRule="auto"/>
+        <w:jc w:val="both"/>
+        <w:rPr>
+          <w:rFonts w:ascii="Calibri" w:hAnsi="Calibri" w:cs="Calibri"/>
+          <w:sz w:val="22"/>
+          <w:szCs w:val="22"/>
+        </w:rPr>
+      </w:pPr>
+      <w:r>
+        <w:rPr>
+          <w:rFonts w:ascii="Calibri" w:hAnsi="Calibri" w:cs="Calibri"/>
+          <w:sz w:val="22"/>
+          <w:szCs w:val="22"/>
+        </w:rPr>
+        <w:t xml:space="preserve">[6] REIMERS, N.; GUREVYCH, I. Sentence-BERT: Sentence Embeddings using Siamese BERT-Networks. In: Proceedings of EMNLP-IJCNLP, 2019.</w:t>
       </w:r>
     </w:p>
     <w:p>

</xml_diff>